<commit_message>
Update GitHub URLs after renaming the account to snndry.
Co-authored-by: Cursor <cursoragent@cursor.com>
</commit_message>
<xml_diff>
--- a/Shakespeare_LLM_From_Scratch_Kapsamli_Dokumantasyon.docx
+++ b/Shakespeare_LLM_From_Scratch_Kapsamli_Dokumantasyon.docx
@@ -694,7 +694,7 @@
                 <w:color w:val="1F2937"/>
                 <w:sz w:val="20"/>
               </w:rPr>
-              <w:t>SdRy69/Shakespeare-LLM-From-Scratch</w:t>
+              <w:t>snndry/Shakespeare-LLM-From-Scratch</w:t>
             </w:r>
           </w:p>
         </w:tc>
@@ -4506,7 +4506,7 @@
           <w:color w:val="1F2937"/>
           <w:sz w:val="18"/>
         </w:rPr>
-        <w:t>git clone https://github.com/SdRy69/Shakespeare-LLM-From-Scratch.git</w:t>
+        <w:t>git clone https://github.com/snndry/Shakespeare-LLM-From-Scratch.git</w:t>
         <w:br/>
         <w:t>cd Shakespeare-LLM-From-Scratch</w:t>
         <w:br/>
@@ -7207,7 +7207,7 @@
           <w:color w:val="1F2937"/>
           <w:sz w:val="22"/>
         </w:rPr>
-        <w:t>Kod tabanı GitHub’da public’tir (SdRy69/Shakespeare-LLM-From-Scratch). README kurulum ve Mermaid akışını; bu belge ürün sözleşmesi, bileşen envanteri ve mimari değerlendirmeyi tutar. 500 adımlık kompakt koşu bir demo’dur; kaliteli dize için kapasite ve iterasyon artırılmalıdır.</w:t>
+        <w:t>Kod tabanı GitHub’da public’tir (snndry/Shakespeare-LLM-From-Scratch). README kurulum ve Mermaid akışını; bu belge ürün sözleşmesi, bileşen envanteri ve mimari değerlendirmeyi tutar. 500 adımlık kompakt koşu bir demo’dur; kaliteli dize için kapasite ve iterasyon artırılmalıdır.</w:t>
       </w:r>
     </w:p>
     <w:p>
@@ -7251,7 +7251,7 @@
         <w:color w:val="4B5563"/>
         <w:sz w:val="16"/>
       </w:rPr>
-      <w:t>Shakespeare-LLM-From-Scratch  ·  Kapsamlı dokümantasyon  ·  github.com/SdRy69/Shakespeare-LLM-From-Scratch</w:t>
+      <w:t>Shakespeare-LLM-From-Scratch  ·  Kapsamlı dokümantasyon  ·  github.com/snndry/Shakespeare-LLM-From-Scratch</w:t>
     </w:r>
   </w:p>
 </w:ftr>

</xml_diff>